<commit_message>
docs: concluir documentação e consistência da Fase 4 (T15)
</commit_message>
<xml_diff>
--- a/docs/05-banco-de-dados/entrega/Fintech-Fase4-Comandos-SQL-RM571266.docx
+++ b/docs/05-banco-de-dados/entrega/Fintech-Fase4-Comandos-SQL-RM571266.docx
@@ -271,7 +271,7 @@
       <w:r>
         <w:drawing>
           <wp:inline xmlns:a="http://schemas.openxmlformats.org/drawingml/2006/main" xmlns:pic="http://schemas.openxmlformats.org/drawingml/2006/picture">
-            <wp:extent cx="6120000" cy="4458928"/>
+            <wp:extent cx="6120000" cy="4447289"/>
             <wp:docPr id="2" name="Picture 2"/>
             <wp:cNvGraphicFramePr>
               <a:graphicFrameLocks noChangeAspect="1"/>
@@ -292,7 +292,7 @@
                   <pic:spPr>
                     <a:xfrm>
                       <a:off x="0" y="0"/>
-                      <a:ext cx="6120000" cy="4458928"/>
+                      <a:ext cx="6120000" cy="4447289"/>
                     </a:xfrm>
                     <a:prstGeom prst="rect"/>
                   </pic:spPr>

</xml_diff>